<commit_message>
fix: exige assinatura no checklist do romaneio
</commit_message>
<xml_diff>
--- a/Modelos/definitivos/Checklist.docx
+++ b/Modelos/definitivos/Checklist.docx
@@ -51,14 +51,12 @@
     <w:tbl>
       <w:tblPr>
         <w:tblStyle w:val="Tabelacomgrade"/>
-        <w:tblW w:w="10343" w:type="dxa"/>
+        <w:tblW w:w="10485" w:type="dxa"/>
         <w:jc w:val="center"/>
         <w:tblLook w:val="04A0" w:firstRow="1" w:lastRow="0" w:firstColumn="1" w:lastColumn="0" w:noHBand="0" w:noVBand="1"/>
       </w:tblPr>
       <w:tblGrid>
-        <w:gridCol w:w="5954"/>
-        <w:gridCol w:w="1984"/>
-        <w:gridCol w:w="2405"/>
+        <w:gridCol w:w="10485"/>
       </w:tblGrid>
       <w:tr>
         <w:trPr>
@@ -67,14 +65,7 @@
         </w:trPr>
         <w:tc>
           <w:tcPr>
-            <w:tcW w:w="10343" w:type="dxa"/>
-            <w:gridSpan w:val="3"/>
-            <w:tcBorders>
-              <w:top w:val="nil"/>
-              <w:left w:val="nil"/>
-              <w:bottom w:val="single" w:sz="4" w:space="0" w:color="auto"/>
-              <w:right w:val="nil"/>
-            </w:tcBorders>
+            <w:tcW w:w="10485" w:type="dxa"/>
             <w:shd w:val="clear" w:color="auto" w:fill="30503A"/>
             <w:vAlign w:val="center"/>
           </w:tcPr>
@@ -122,108 +113,7 @@
         </w:trPr>
         <w:tc>
           <w:tcPr>
-            <w:tcW w:w="5954" w:type="dxa"/>
-            <w:tcBorders>
-              <w:top w:val="single" w:sz="4" w:space="0" w:color="auto"/>
-              <w:left w:val="single" w:sz="4" w:space="0" w:color="auto"/>
-              <w:bottom w:val="single" w:sz="4" w:space="0" w:color="auto"/>
-              <w:right w:val="single" w:sz="4" w:space="0" w:color="auto"/>
-            </w:tcBorders>
-            <w:shd w:val="clear" w:color="auto" w:fill="FFFFFF" w:themeFill="background1"/>
-            <w:vAlign w:val="center"/>
-          </w:tcPr>
-          <w:p>
-            <w:pPr>
-              <w:rPr>
-                <w:rFonts w:ascii="Arial" w:hAnsi="Arial" w:cs="Arial"/>
-              </w:rPr>
-            </w:pPr>
-            <w:r>
-              <w:rPr>
-                <w:rFonts w:ascii="Arial" w:hAnsi="Arial" w:cs="Arial"/>
-                <w:b/>
-                <w:bCs/>
-              </w:rPr>
-              <w:t xml:space="preserve">Equipamento: </w:t>
-            </w:r>
-            <w:r>
-              <w:rPr>
-                <w:rFonts w:ascii="Arial" w:hAnsi="Arial" w:cs="Arial"/>
-                <w:b/>
-                <w:bCs/>
-                <w:color w:val="11437E"/>
-              </w:rPr>
-              <w:t>&lt;&lt;equipamento&gt;&gt;</w:t>
-            </w:r>
-          </w:p>
-        </w:tc>
-        <w:tc>
-          <w:tcPr>
-            <w:tcW w:w="1984" w:type="dxa"/>
-            <w:tcBorders>
-              <w:top w:val="single" w:sz="4" w:space="0" w:color="auto"/>
-              <w:left w:val="single" w:sz="4" w:space="0" w:color="auto"/>
-              <w:bottom w:val="single" w:sz="4" w:space="0" w:color="auto"/>
-              <w:right w:val="single" w:sz="4" w:space="0" w:color="auto"/>
-            </w:tcBorders>
-            <w:shd w:val="clear" w:color="auto" w:fill="FFFFFF" w:themeFill="background1"/>
-            <w:vAlign w:val="center"/>
-          </w:tcPr>
-          <w:p>
-            <w:pPr>
-              <w:rPr>
-                <w:rFonts w:ascii="Arial" w:hAnsi="Arial" w:cs="Arial"/>
-              </w:rPr>
-            </w:pPr>
-            <w:r>
-              <w:rPr>
-                <w:rFonts w:ascii="Arial" w:hAnsi="Arial" w:cs="Arial"/>
-                <w:b/>
-                <w:bCs/>
-              </w:rPr>
-              <w:t xml:space="preserve">TAG: </w:t>
-            </w:r>
-            <w:r>
-              <w:rPr>
-                <w:rFonts w:ascii="Arial" w:hAnsi="Arial" w:cs="Arial"/>
-                <w:b/>
-                <w:bCs/>
-                <w:color w:val="11437E"/>
-              </w:rPr>
-              <w:t>&lt;&lt;</w:t>
-            </w:r>
-            <w:proofErr w:type="spellStart"/>
-            <w:r>
-              <w:rPr>
-                <w:rFonts w:ascii="Arial" w:hAnsi="Arial" w:cs="Arial"/>
-                <w:b/>
-                <w:bCs/>
-                <w:color w:val="11437E"/>
-              </w:rPr>
-              <w:t>tag</w:t>
-            </w:r>
-            <w:proofErr w:type="spellEnd"/>
-            <w:r>
-              <w:rPr>
-                <w:rFonts w:ascii="Arial" w:hAnsi="Arial" w:cs="Arial"/>
-                <w:b/>
-                <w:bCs/>
-                <w:color w:val="11437E"/>
-              </w:rPr>
-              <w:t>&gt;&gt;</w:t>
-            </w:r>
-          </w:p>
-        </w:tc>
-        <w:tc>
-          <w:tcPr>
-            <w:tcW w:w="2405" w:type="dxa"/>
-            <w:tcBorders>
-              <w:top w:val="single" w:sz="4" w:space="0" w:color="auto"/>
-              <w:left w:val="single" w:sz="4" w:space="0" w:color="auto"/>
-              <w:bottom w:val="single" w:sz="4" w:space="0" w:color="auto"/>
-              <w:right w:val="single" w:sz="4" w:space="0" w:color="auto"/>
-            </w:tcBorders>
-            <w:shd w:val="clear" w:color="auto" w:fill="FFFFFF" w:themeFill="background1"/>
+            <w:tcW w:w="10485" w:type="dxa"/>
             <w:vAlign w:val="center"/>
           </w:tcPr>
           <w:p>
@@ -300,11 +190,15 @@
         <w:gridCol w:w="5228"/>
       </w:tblGrid>
       <w:tr>
+        <w:trPr>
+          <w:trHeight w:val="332"/>
+        </w:trPr>
         <w:tc>
           <w:tcPr>
             <w:tcW w:w="10456" w:type="dxa"/>
             <w:gridSpan w:val="2"/>
             <w:shd w:val="clear" w:color="auto" w:fill="30503A"/>
+            <w:vAlign w:val="center"/>
           </w:tcPr>
           <w:p>
             <w:pPr>
@@ -379,6 +273,7 @@
         <w:tc>
           <w:tcPr>
             <w:tcW w:w="5228" w:type="dxa"/>
+            <w:vAlign w:val="center"/>
           </w:tcPr>
           <w:p>
             <w:pPr>
@@ -414,6 +309,7 @@
         <w:tc>
           <w:tcPr>
             <w:tcW w:w="5228" w:type="dxa"/>
+            <w:vAlign w:val="center"/>
           </w:tcPr>
           <w:p>
             <w:pPr>

</xml_diff>